<commit_message>
Add Epoch AI chip sales analysis report
</commit_message>
<xml_diff>
--- a/llm_token_capacity_project/outputs/reports/agent_learning_expansion_pack_kr.docx
+++ b/llm_token_capacity_project/outputs/reports/agent_learning_expansion_pack_kr.docx
@@ -38,14 +38,6 @@
     </w:p>
     <w:p>
       <w:pPr>
-        <w:pStyle w:val="Heading1"/>
-      </w:pPr>
-      <w:r>
-        <w:t>목적</w:t>
-      </w:r>
-    </w:p>
-    <w:p>
-      <w:pPr>
         <w:spacing w:after="140"/>
       </w:pPr>
       <w:r>
@@ -53,7 +45,7 @@
           <w:rFonts w:ascii="Apple SD Gothic Neo" w:hAnsi="Apple SD Gothic Neo"/>
           <w:sz w:val="20"/>
         </w:rPr>
-        <w:t>이 산출물은 10개 assumption agent의 학습 범위를 확장하기 위한 운영 자료입니다. 최신 IEA 2026, inference energy, prefill-decode disaggregation, rack-scale power/cooling, benchmark/proxy 자료를 agent별 curriculum으로 매핑합니다.</w:t>
+        <w:t>업데이트: 2026-06-09</w:t>
       </w:r>
     </w:p>
     <w:p>
@@ -61,6 +53,26 @@
         <w:pStyle w:val="Heading1"/>
       </w:pPr>
       <w:r>
+        <w:t>목적</w:t>
+      </w:r>
+    </w:p>
+    <w:p>
+      <w:pPr>
+        <w:spacing w:after="140"/>
+      </w:pPr>
+      <w:r>
+        <w:rPr>
+          <w:rFonts w:ascii="Apple SD Gothic Neo" w:hAnsi="Apple SD Gothic Neo"/>
+          <w:sz w:val="20"/>
+        </w:rPr>
+        <w:t>이 산출물은 11개 assumption agent의 학습 범위를 확장하기 위한 운영 자료입니다. 최신 IEA 2026, inference energy, prefill-decode disaggregation, rack-scale power/cooling, benchmark/proxy 자료를 agent별 curriculum으로 매핑합니다.</w:t>
+      </w:r>
+    </w:p>
+    <w:p>
+      <w:pPr>
+        <w:pStyle w:val="Heading1"/>
+      </w:pPr>
+      <w:r>
         <w:t>운영 원칙</w:t>
       </w:r>
     </w:p>
@@ -86,6 +98,22 @@
       </w:pPr>
       <w:r>
         <w:t>InferenceX, AI 2027, Deloitte, McKinsey 등은 유용하지만 production telemetry가 아닙니다.</w:t>
+      </w:r>
+    </w:p>
+    <w:p>
+      <w:pPr>
+        <w:pStyle w:val="ListBullet"/>
+      </w:pPr>
+      <w:r>
+        <w:t>MLPerf, InferenceX, vendor benchmark는 서로 보완재입니다. MLPerf는 규칙화된 official submission anchor이고, InferenceX는 LLM serving 조건별 proxy이며, vendor stack docs는 mechanism/source-of-implementation입니다.</w:t>
+      </w:r>
+    </w:p>
+    <w:p>
+      <w:pPr>
+        <w:pStyle w:val="ListBullet"/>
+      </w:pPr>
+      <w:r>
+        <w:t>Epoch AI는 training scale, power envelope, inference price trend, scaling bottleneck을 읽는 핵심 research source이지만 회사별 production allocation fact는 아닙니다.</w:t>
       </w:r>
     </w:p>
     <w:p>
@@ -193,6 +221,22 @@
         <w:pStyle w:val="ListBullet"/>
       </w:pPr>
       <w:r>
+        <w:t>EIA_DC_POWER: [U.S. data center electricity demand and grid context](https://www.eia.gov/) - U.S. EIA, accessed 2026-06-09. 목적: electricity demand and regional power baseline.</w:t>
+      </w:r>
+    </w:p>
+    <w:p>
+      <w:pPr>
+        <w:pStyle w:val="ListBullet"/>
+      </w:pPr>
+      <w:r>
+        <w:t>FERC_INTERCONNECT: [FERC generator interconnection and grid proceedings](https://www.ferc.gov/) - FERC, accessed 2026-06-09. 목적: interconnection, transmission, reliability context.</w:t>
+      </w:r>
+    </w:p>
+    <w:p>
+      <w:pPr>
+        <w:pStyle w:val="ListBullet"/>
+      </w:pPr>
+      <w:r>
         <w:t>OPENAI_STARGATE: [Five new Stargate sites](https://openai.com/index/five-new-stargate-sites/) - OpenAI, 2025. 목적: planned capacity and attribution.</w:t>
       </w:r>
     </w:p>
@@ -202,6 +246,14 @@
       </w:pPr>
       <w:r>
         <w:t>DELOITTE_AI_DC: [AI infrastructure gaps](https://www.deloitte.com/us/en/insights/industry/power-and-utilities/data-center-infrastructure-artificial-intelligence.html) - Deloitte Insights, 2025. 목적: market context for infra constraints.</w:t>
+      </w:r>
+    </w:p>
+    <w:p>
+      <w:pPr>
+        <w:pStyle w:val="ListBullet"/>
+      </w:pPr>
+      <w:r>
+        <w:t>EPOCH_SCALING_2030: [Can AI scaling continue through 2030?](https://epoch.ai/publications/can-ai-scaling-continue-through-2030) - Epoch AI, 2024/2026 accessed. 목적: scaling bottlenecks, power/data/capex.</w:t>
       </w:r>
     </w:p>
     <w:p>
@@ -337,7 +389,31 @@
         <w:pStyle w:val="ListBullet"/>
       </w:pPr>
       <w:r>
+        <w:t>NVIDIA_B200_DATASHEET: [NVIDIA Blackwell architecture and B200/GB200 data center docs](https://www.nvidia.com/en-us/data-center/) - NVIDIA, accessed 2026-06-09. 목적: accelerator/rack power and platform specs.</w:t>
+      </w:r>
+    </w:p>
+    <w:p>
+      <w:pPr>
+        <w:pStyle w:val="ListBullet"/>
+      </w:pPr>
+      <w:r>
         <w:t>AWS_RAINIER: [AWS Project Rainier](https://www.aboutamazon.com/news/aws/aws-project-rainier-ai-trainium-chips-compute-cluster) - Amazon, 2025. 목적: Anthropic/AWS Trainium cluster.</w:t>
+      </w:r>
+    </w:p>
+    <w:p>
+      <w:pPr>
+        <w:pStyle w:val="ListBullet"/>
+      </w:pPr>
+      <w:r>
+        <w:t>GOOGLE_TPU_DOCS: [Cloud TPU documentation](https://cloud.google.com/tpu/docs) - Google Cloud, accessed 2026-06-09. 목적: TPU generation and serving/training platform docs.</w:t>
+      </w:r>
+    </w:p>
+    <w:p>
+      <w:pPr>
+        <w:pStyle w:val="ListBullet"/>
+      </w:pPr>
+      <w:r>
+        <w:t>MS_MAIA: [Azure Maia AI Accelerator](https://azure.microsoft.com/en-us/blog/introducing-azure-maia-100/) - Microsoft Azure, 2023/2026 accessed. 목적: first-party accelerator deployment direction.</w:t>
       </w:r>
     </w:p>
     <w:p>
@@ -505,6 +581,22 @@
         <w:pStyle w:val="ListBullet"/>
       </w:pPr>
       <w:r>
+        <w:t>UPTIME_GLOBAL_DC: [Uptime Institute Global Data Center Survey](https://uptimeinstitute.com/resources/research-and-reports) - Uptime Institute, accessed 2026-06-09. 목적: PUE, cooling, outage, density operating context.</w:t>
+      </w:r>
+    </w:p>
+    <w:p>
+      <w:pPr>
+        <w:pStyle w:val="ListBullet"/>
+      </w:pPr>
+      <w:r>
+        <w:t>ASHRAE_TC99: [ASHRAE TC 9.9 data center thermal guidance](https://www.ashrae.org/technical-resources/bookstore/datacom-series) - ASHRAE, accessed 2026-06-09. 목적: thermal envelope and cooling design reference.</w:t>
+      </w:r>
+    </w:p>
+    <w:p>
+      <w:pPr>
+        <w:pStyle w:val="ListBullet"/>
+      </w:pPr>
+      <w:r>
         <w:t>MCK_POWER_COOL: [Beyond compute: infrastructure that powers and cools AI data centers](https://www.mckinsey.com/industries/industrials-and-electronics/our-insights/beyond-compute-infrastructure-that-powers-and-cools-ai-data-centers) - McKinsey, 2025. 목적: power/cooling investment context.</w:t>
       </w:r>
     </w:p>
@@ -646,6 +738,22 @@
     </w:p>
     <w:p>
       <w:pPr>
+        <w:pStyle w:val="ListBullet"/>
+      </w:pPr>
+      <w:r>
+        <w:t>SEMI_100K_CLUSTER: [SemiAnalysis 100k H100 cluster / AI infrastructure analysis](https://semianalysis.com/) - SemiAnalysis, accessed 2026-06-09. 목적: accelerator cluster, networking, non-GPU overhead context.</w:t>
+      </w:r>
+    </w:p>
+    <w:p>
+      <w:pPr>
+        <w:pStyle w:val="ListBullet"/>
+      </w:pPr>
+      <w:r>
+        <w:t>DELLORO_AI_NETWORKS: [AI networks and data center switch market context](https://www.delloro.com/) - Dell'Oro Group, accessed 2026-06-09. 목적: network/power overhead and AI cluster infrastructure context.</w:t>
+      </w:r>
+    </w:p>
+    <w:p>
+      <w:pPr>
         <w:spacing w:after="140"/>
       </w:pPr>
       <w:r>
@@ -769,6 +877,30 @@
         <w:pStyle w:val="ListBullet"/>
       </w:pPr>
       <w:r>
+        <w:t>EPOCH_INFERENCE_PRICE: [LLM inference price trends](https://epoch.ai/data-insights/llm-inference-price-trends) - Epoch AI, accessed 2026-06-09. 목적: inference cost trend proxy.</w:t>
+      </w:r>
+    </w:p>
+    <w:p>
+      <w:pPr>
+        <w:pStyle w:val="ListBullet"/>
+      </w:pPr>
+      <w:r>
+        <w:t>ARTIFICIAL_ANALYSIS: [Artificial Analysis model and API pricing benchmarks](https://artificialanalysis.ai/) - Artificial Analysis, accessed 2026-06-09. 목적: public API price/performance and latency proxy.</w:t>
+      </w:r>
+    </w:p>
+    <w:p>
+      <w:pPr>
+        <w:pStyle w:val="ListBullet"/>
+      </w:pPr>
+      <w:r>
+        <w:t>OPENROUTER_RANKINGS: [OpenRouter model pricing and usage market signals](https://openrouter.ai/rankings) - OpenRouter, accessed 2026-06-09. 목적: API price and demand mix proxy.</w:t>
+      </w:r>
+    </w:p>
+    <w:p>
+      <w:pPr>
+        <w:pStyle w:val="ListBullet"/>
+      </w:pPr>
+      <w:r>
         <w:t>DELOITTE_AI_DC: [AI infrastructure gaps](https://www.deloitte.com/us/en/insights/industry/power-and-utilities/data-center-infrastructure-artificial-intelligence.html) - Deloitte Insights, 2025. 목적: market context for infra constraints.</w:t>
       </w:r>
     </w:p>
@@ -897,6 +1029,30 @@
         <w:pStyle w:val="ListBullet"/>
       </w:pPr>
       <w:r>
+        <w:t>EPOCH_TRAIN: [Training compute of frontier AI models grows by 4-5x per year](https://epoch.ai/blog/training-compute-of-frontier-ai-models-grows-by-4-5x-per-year) - Epoch AI, 2024. 목적: frontier training compute growth.</w:t>
+      </w:r>
+    </w:p>
+    <w:p>
+      <w:pPr>
+        <w:pStyle w:val="ListBullet"/>
+      </w:pPr>
+      <w:r>
+        <w:t>EPOCH_SCALING_2030: [Can AI scaling continue through 2030?](https://epoch.ai/publications/can-ai-scaling-continue-through-2030) - Epoch AI, 2024/2026 accessed. 목적: scaling bottlenecks, power/data/capex.</w:t>
+      </w:r>
+    </w:p>
+    <w:p>
+      <w:pPr>
+        <w:pStyle w:val="ListBullet"/>
+      </w:pPr>
+      <w:r>
+        <w:t>EPRI_EPOCH_SCALING: [Scaling Intelligence](https://www.epri.com/research/products/000000003002033669) - EPRI / Epoch AI, 2025. 목적: AI power capacity and frontier training scenario.</w:t>
+      </w:r>
+    </w:p>
+    <w:p>
+      <w:pPr>
+        <w:pStyle w:val="ListBullet"/>
+      </w:pPr>
+      <w:r>
         <w:t>STANFORD_INDEX_2025: [AI Index Report 2025](https://hai.stanford.edu/ai-index/2025-ai-index-report) - Stanford HAI, 2025. 목적: macro AI compute/cost context.</w:t>
       </w:r>
     </w:p>
@@ -1038,6 +1194,46 @@
     </w:p>
     <w:p>
       <w:pPr>
+        <w:pStyle w:val="ListBullet"/>
+      </w:pPr>
+      <w:r>
+        <w:t>META_LLAMA: [Llama model family and model cards](https://www.llama.com/) - Meta AI, accessed 2026-06-09. 목적: Llama open model parameter and context anchor.</w:t>
+      </w:r>
+    </w:p>
+    <w:p>
+      <w:pPr>
+        <w:pStyle w:val="ListBullet"/>
+      </w:pPr>
+      <w:r>
+        <w:t>META_LLAMA4_NVIDIA: [Meta Llama 4 NVIDIA optimization notes](https://developer.nvidia.com/blog/meta-llama-4-first-nvidia-optimized-mixture-of-experts-models/) - NVIDIA Developer, 2025. 목적: Llama 4 MoE total/active parameter anchor.</w:t>
+      </w:r>
+    </w:p>
+    <w:p>
+      <w:pPr>
+        <w:pStyle w:val="ListBullet"/>
+      </w:pPr>
+      <w:r>
+        <w:t>MISTRAL_MODELS: [Mistral AI models and documentation](https://docs.mistral.ai/) - Mistral AI, accessed 2026-06-09. 목적: dense/MoE open model family anchor.</w:t>
+      </w:r>
+    </w:p>
+    <w:p>
+      <w:pPr>
+        <w:pStyle w:val="ListBullet"/>
+      </w:pPr>
+      <w:r>
+        <w:t>DBRX_MODEL: [DBRX model announcement and model card](https://www.databricks.com/blog/introducing-dbrx-new-state-art-open-llm) - Databricks, 2024. 목적: open MoE parameter anchor.</w:t>
+      </w:r>
+    </w:p>
+    <w:p>
+      <w:pPr>
+        <w:pStyle w:val="ListBullet"/>
+      </w:pPr>
+      <w:r>
+        <w:t>OPENAI_MODEL_DOCS: [OpenAI model docs](https://platform.openai.com/docs/models) - OpenAI, accessed 2026-06-09. 목적: closed model context/output/pricing, not parameter fact.</w:t>
+      </w:r>
+    </w:p>
+    <w:p>
+      <w:pPr>
         <w:spacing w:after="140"/>
       </w:pPr>
       <w:r>
@@ -1153,6 +1349,30 @@
         <w:pStyle w:val="ListBullet"/>
       </w:pPr>
       <w:r>
+        <w:t>MLPERF_INFERENCE: [MLPerf Inference benchmark results](https://mlcommons.org/benchmarks/inference-datacenter/) - MLCommons, accessed 2026-06-09. 목적: official inference submission anchor.</w:t>
+      </w:r>
+    </w:p>
+    <w:p>
+      <w:pPr>
+        <w:pStyle w:val="ListBullet"/>
+      </w:pPr>
+      <w:r>
+        <w:t>MLPERF_POWER: [MLPerf Power methodology and results](https://mlcommons.org/benchmarks/power/) - MLCommons, accessed 2026-06-09. 목적: optional measured power/performance anchor.</w:t>
+      </w:r>
+    </w:p>
+    <w:p>
+      <w:pPr>
+        <w:pStyle w:val="ListBullet"/>
+      </w:pPr>
+      <w:r>
+        <w:t>MLPERF_INFERENCE_DOCS: [MLPerf Inference documentation](https://docs.mlcommons.org/inference/) - MLCommons, accessed 2026-06-09. 목적: benchmark rules, scenarios, loadgen, divisions.</w:t>
+      </w:r>
+    </w:p>
+    <w:p>
+      <w:pPr>
+        <w:pStyle w:val="ListBullet"/>
+      </w:pPr>
+      <w:r>
         <w:t>JOULE_INFERENCE_2026: [Energy use of AI inference, efficiency pathways, and test-time scaling](https://www.sciencedirect.com/science/article/pii/S2542435126001145) - Joule / Cell Press, 2026. 목적: energy/query, token-length, test-time compute.</w:t>
       </w:r>
     </w:p>
@@ -1162,6 +1382,62 @@
       </w:pPr>
       <w:r>
         <w:t>IBM_PD_2026: [Revisiting Disaggregated Large Language Model Serving for Performance and Energy Implications](https://research.ibm.com/publications/revisiting-disaggregated-large-language-model-serving-for-performance-and-energy-implications) - IBM Research / EuroSys, 2026. 목적: prefill-decode disaggregation energy/performance.</w:t>
+      </w:r>
+    </w:p>
+    <w:p>
+      <w:pPr>
+        <w:pStyle w:val="ListBullet"/>
+      </w:pPr>
+      <w:r>
+        <w:t>VLLM_DOCS: [vLLM documentation](https://docs.vllm.ai/) - vLLM project, accessed 2026-06-09. 목적: production serving mechanism and scheduler behavior.</w:t>
+      </w:r>
+    </w:p>
+    <w:p>
+      <w:pPr>
+        <w:pStyle w:val="ListBullet"/>
+      </w:pPr>
+      <w:r>
+        <w:t>TENSORRT_LLM: [NVIDIA TensorRT-LLM documentation](https://nvidia.github.io/TensorRT-LLM/) - NVIDIA, accessed 2026-06-09. 목적: vendor-optimized inference stack.</w:t>
+      </w:r>
+    </w:p>
+    <w:p>
+      <w:pPr>
+        <w:pStyle w:val="ListBullet"/>
+      </w:pPr>
+      <w:r>
+        <w:t>SGLANG_DOCS: [SGLang documentation](https://docs.sglang.ai/) - SGLang project, accessed 2026-06-09. 목적: serving runtime, structured generation and batching.</w:t>
+      </w:r>
+    </w:p>
+    <w:p>
+      <w:pPr>
+        <w:pStyle w:val="ListBullet"/>
+      </w:pPr>
+      <w:r>
+        <w:t>FLASHINFER: [FlashInfer documentation](https://docs.flashinfer.ai/) - FlashInfer project, accessed 2026-06-09. 목적: attention/decode kernel mechanism.</w:t>
+      </w:r>
+    </w:p>
+    <w:p>
+      <w:pPr>
+        <w:pStyle w:val="ListBullet"/>
+      </w:pPr>
+      <w:r>
+        <w:t>SARATHI_SERVE: [Sarathi-Serve](https://arxiv.org/abs/2403.02310) - arXiv, 2024. 목적: chunked prefill and decode scheduling.</w:t>
+      </w:r>
+    </w:p>
+    <w:p>
+      <w:pPr>
+        <w:pStyle w:val="ListBullet"/>
+      </w:pPr>
+      <w:r>
+        <w:t>ORCA_SERVING: [Orca: A Distributed Serving System for Transformer-Based Generative Models](https://www.usenix.org/conference/osdi22/presentation/yu) - OSDI, 2022. 목적: iteration-level scheduling foundation.</w:t>
+      </w:r>
+    </w:p>
+    <w:p>
+      <w:pPr>
+        <w:pStyle w:val="ListBullet"/>
+      </w:pPr>
+      <w:r>
+        <w:t>EPOCH_INFERENCE_PRICE: [LLM inference price trends](https://epoch.ai/data-insights/llm-inference-price-trends) - Epoch AI, accessed 2026-06-09. 목적: inference cost trend proxy.</w:t>
       </w:r>
     </w:p>
     <w:p>
@@ -1321,6 +1597,46 @@
         <w:pStyle w:val="ListBullet"/>
       </w:pPr>
       <w:r>
+        <w:t>MLPERF_INFERENCE_DOCS: [MLPerf Inference documentation](https://docs.mlcommons.org/inference/) - MLCommons, accessed 2026-06-09. 목적: Server/Offline latency and loadgen scenario rules.</w:t>
+      </w:r>
+    </w:p>
+    <w:p>
+      <w:pPr>
+        <w:pStyle w:val="ListBullet"/>
+      </w:pPr>
+      <w:r>
+        <w:t>VLLM_DOCS: [vLLM documentation](https://docs.vllm.ai/) - vLLM project, accessed 2026-06-09. 목적: scheduler, KV cache, batching, prefix caching.</w:t>
+      </w:r>
+    </w:p>
+    <w:p>
+      <w:pPr>
+        <w:pStyle w:val="ListBullet"/>
+      </w:pPr>
+      <w:r>
+        <w:t>SGLANG_DOCS: [SGLang documentation](https://docs.sglang.ai/) - SGLang project, accessed 2026-06-09. 목적: runtime, batching and structured generation operational behavior.</w:t>
+      </w:r>
+    </w:p>
+    <w:p>
+      <w:pPr>
+        <w:pStyle w:val="ListBullet"/>
+      </w:pPr>
+      <w:r>
+        <w:t>SARATHI_SERVE: [Sarathi-Serve](https://arxiv.org/abs/2403.02310) - arXiv, 2024. 목적: chunked prefill and utilization/latency tradeoff.</w:t>
+      </w:r>
+    </w:p>
+    <w:p>
+      <w:pPr>
+        <w:pStyle w:val="ListBullet"/>
+      </w:pPr>
+      <w:r>
+        <w:t>ORCA_SERVING: [Orca: A Distributed Serving System for Transformer-Based Generative Models](https://www.usenix.org/conference/osdi22/presentation/yu) - OSDI, 2022. 목적: iteration-level scheduling and batching foundation.</w:t>
+      </w:r>
+    </w:p>
+    <w:p>
+      <w:pPr>
+        <w:pStyle w:val="ListBullet"/>
+      </w:pPr>
+      <w:r>
         <w:t>ARXIV_SLO_PD_2603: [SLO-Aware Compute Resource Allocation for Prefill-Decode Disaggregated LLM Inference](https://arxiv.org/abs/2603.04716) - arXiv, 2026. 목적: SLO-aware P/D resource allocation.</w:t>
       </w:r>
     </w:p>
@@ -1481,6 +1797,46 @@
         <w:pStyle w:val="ListBullet"/>
       </w:pPr>
       <w:r>
+        <w:t>ANTHROPIC_AMAZON_COMPUTE: [Amazon and Anthropic strategic collaboration](https://www.aboutamazon.com/news/aws/amazon-anthropic-ai-investment) - Amazon, accessed 2026-06-09. 목적: host provider vs model owner compute relationship.</w:t>
+      </w:r>
+    </w:p>
+    <w:p>
+      <w:pPr>
+        <w:pStyle w:val="ListBullet"/>
+      </w:pPr>
+      <w:r>
+        <w:t>GOOGLE_CLOUD_ANTHROPIC: [Google Cloud and Anthropic partnership](https://cloud.google.com/blog/products/ai-machine-learning/google-cloud-anthropic-ai-partnership) - Google Cloud, accessed 2026-06-09. 목적: third-party model hosted on cloud provider.</w:t>
+      </w:r>
+    </w:p>
+    <w:p>
+      <w:pPr>
+        <w:pStyle w:val="ListBullet"/>
+      </w:pPr>
+      <w:r>
+        <w:t>AZURE_OPENAI: [Azure OpenAI Service documentation](https://learn.microsoft.com/azure/ai-services/openai/) - Microsoft, accessed 2026-06-09. 목적: Microsoft host/product surface vs OpenAI model attribution.</w:t>
+      </w:r>
+    </w:p>
+    <w:p>
+      <w:pPr>
+        <w:pStyle w:val="ListBullet"/>
+      </w:pPr>
+      <w:r>
+        <w:t>OPENAI_API_PRICING: [OpenAI API pricing](https://openai.com/api/pricing/) - OpenAI, accessed 2026-06-09. 목적: model-owner commercial token surface proxy.</w:t>
+      </w:r>
+    </w:p>
+    <w:p>
+      <w:pPr>
+        <w:pStyle w:val="ListBullet"/>
+      </w:pPr>
+      <w:r>
+        <w:t>ANTHROPIC_PRICING: [Anthropic API pricing](https://www.anthropic.com/pricing) - Anthropic, accessed 2026-06-09. 목적: model-owner commercial token surface proxy.</w:t>
+      </w:r>
+    </w:p>
+    <w:p>
+      <w:pPr>
+        <w:pStyle w:val="ListBullet"/>
+      </w:pPr>
+      <w:r>
         <w:t>AI_2027: [AI 2027](https://ai-2027.com/) - AI Futures Project, 2025. 목적: stress scenario for accelerated adoption.</w:t>
       </w:r>
     </w:p>
@@ -1554,6 +1910,190 @@
     </w:p>
     <w:p>
       <w:pPr>
+        <w:pStyle w:val="Heading2"/>
+      </w:pPr>
+      <w:r>
+        <w:t>A11 `gpu_asic_mix`</w:t>
+      </w:r>
+    </w:p>
+    <w:p>
+      <w:pPr>
+        <w:spacing w:after="140"/>
+      </w:pPr>
+      <w:r>
+        <w:rPr>
+          <w:rFonts w:ascii="Apple SD Gothic Neo" w:hAnsi="Apple SD Gothic Neo"/>
+          <w:sz w:val="20"/>
+        </w:rPr>
+        <w:t>확장 주제: GPU generation mix, purpose-built accelerator substitution, comparable benchmark replacement</w:t>
+      </w:r>
+    </w:p>
+    <w:p>
+      <w:pPr>
+        <w:spacing w:after="140"/>
+      </w:pPr>
+      <w:r>
+        <w:rPr>
+          <w:rFonts w:ascii="Apple SD Gothic Neo" w:hAnsi="Apple SD Gothic Neo"/>
+          <w:sz w:val="20"/>
+        </w:rPr>
+        <w:t>핵심 규칙: Keep H200/B200/GB200/purpose-built shares as editable scenario inputs until provider deployment or accelerator-hour evidence exists.</w:t>
+      </w:r>
+    </w:p>
+    <w:p>
+      <w:pPr>
+        <w:spacing w:after="140"/>
+      </w:pPr>
+      <w:r>
+        <w:rPr>
+          <w:rFonts w:ascii="Apple SD Gothic Neo" w:hAnsi="Apple SD Gothic Neo"/>
+          <w:sz w:val="20"/>
+        </w:rPr>
+        <w:t>읽을 source:</w:t>
+      </w:r>
+    </w:p>
+    <w:p>
+      <w:pPr>
+        <w:pStyle w:val="ListBullet"/>
+      </w:pPr>
+      <w:r>
+        <w:t>MLPERF_INFERENCE: [MLPerf Inference benchmark results](https://mlcommons.org/benchmarks/inference-datacenter/) - MLCommons, accessed 2026-06-09. 목적: official inference submission anchor.</w:t>
+      </w:r>
+    </w:p>
+    <w:p>
+      <w:pPr>
+        <w:pStyle w:val="ListBullet"/>
+      </w:pPr>
+      <w:r>
+        <w:t>MLPERF_POWER: [MLPerf Power methodology and results](https://mlcommons.org/benchmarks/power/) - MLCommons, accessed 2026-06-09. 목적: optional measured power/performance anchor.</w:t>
+      </w:r>
+    </w:p>
+    <w:p>
+      <w:pPr>
+        <w:pStyle w:val="ListBullet"/>
+      </w:pPr>
+      <w:r>
+        <w:t>NVIDIA_DGX_GB: [NVIDIA DGX GB Rack Scale Systems User Guide](https://docs.nvidia.com/dgx/dgxgb200-user-guide/hardware.html) - NVIDIA, accessed 2026-05-18. 목적: rack power/cooling architecture.</w:t>
+      </w:r>
+    </w:p>
+    <w:p>
+      <w:pPr>
+        <w:pStyle w:val="ListBullet"/>
+      </w:pPr>
+      <w:r>
+        <w:t>NVIDIA_GB200: [NVIDIA GB200 NVL72](https://www.nvidia.com/en-us/data-center/gb200-nvl72/) - NVIDIA, accessed 2026-05-18. 목적: rack-scale Blackwell system.</w:t>
+      </w:r>
+    </w:p>
+    <w:p>
+      <w:pPr>
+        <w:pStyle w:val="ListBullet"/>
+      </w:pPr>
+      <w:r>
+        <w:t>NVIDIA_B200_DATASHEET: [NVIDIA Blackwell architecture and B200/GB200 data center docs](https://www.nvidia.com/en-us/data-center/) - NVIDIA, accessed 2026-06-09. 목적: accelerator/rack power and platform specs.</w:t>
+      </w:r>
+    </w:p>
+    <w:p>
+      <w:pPr>
+        <w:pStyle w:val="ListBullet"/>
+      </w:pPr>
+      <w:r>
+        <w:t>GOOGLE_TPU_DOCS: [Cloud TPU documentation](https://cloud.google.com/tpu/docs) - Google Cloud, accessed 2026-06-09. 목적: TPU generation and serving/training platform docs.</w:t>
+      </w:r>
+    </w:p>
+    <w:p>
+      <w:pPr>
+        <w:pStyle w:val="ListBullet"/>
+      </w:pPr>
+      <w:r>
+        <w:t>GOOGLE_IRONWOOD: [Ironwood TPU: age of inference](https://blog.google/products/google-cloud/ironwood-tpu-age-of-inference/) - Google Cloud, 2025. 목적: inference-optimized TPU direction.</w:t>
+      </w:r>
+    </w:p>
+    <w:p>
+      <w:pPr>
+        <w:pStyle w:val="ListBullet"/>
+      </w:pPr>
+      <w:r>
+        <w:t>MS_MAIA: [Azure Maia AI Accelerator](https://azure.microsoft.com/en-us/blog/introducing-azure-maia-100/) - Microsoft Azure, 2023/2026 accessed. 목적: first-party accelerator deployment direction.</w:t>
+      </w:r>
+    </w:p>
+    <w:p>
+      <w:pPr>
+        <w:pStyle w:val="ListBullet"/>
+      </w:pPr>
+      <w:r>
+        <w:t>AWS_RAINIER: [AWS Project Rainier](https://www.aboutamazon.com/news/aws/aws-project-rainier-ai-trainium-chips-compute-cluster) - Amazon, 2025. 목적: Anthropic/AWS Trainium cluster.</w:t>
+      </w:r>
+    </w:p>
+    <w:p>
+      <w:pPr>
+        <w:pStyle w:val="ListBullet"/>
+      </w:pPr>
+      <w:r>
+        <w:t>TENSORRT_LLM: [NVIDIA TensorRT-LLM documentation](https://nvidia.github.io/TensorRT-LLM/) - NVIDIA, accessed 2026-06-09. 목적: vendor-optimized inference stack.</w:t>
+      </w:r>
+    </w:p>
+    <w:p>
+      <w:pPr>
+        <w:spacing w:after="140"/>
+      </w:pPr>
+      <w:r>
+        <w:rPr>
+          <w:rFonts w:ascii="Apple SD Gothic Neo" w:hAnsi="Apple SD Gothic Neo"/>
+          <w:sz w:val="20"/>
+        </w:rPr>
+        <w:t>Evidence promotion task:</w:t>
+      </w:r>
+    </w:p>
+    <w:p>
+      <w:pPr>
+        <w:spacing w:after="140"/>
+      </w:pPr>
+      <w:r>
+        <w:rPr>
+          <w:rFonts w:ascii="Apple SD Gothic Neo" w:hAnsi="Apple SD Gothic Neo"/>
+          <w:sz w:val="20"/>
+        </w:rPr>
+        <w:t>1. 위 source 중 GPU 2개, purpose-built accelerator 2개를 골라 platform fact와 benchmark proxy를 분리합니다.</w:t>
+      </w:r>
+    </w:p>
+    <w:p>
+      <w:pPr>
+        <w:spacing w:after="140"/>
+      </w:pPr>
+      <w:r>
+        <w:rPr>
+          <w:rFonts w:ascii="Apple SD Gothic Neo" w:hAnsi="Apple SD Gothic Neo"/>
+          <w:sz w:val="20"/>
+        </w:rPr>
+        <w:t>2. 각 claim을 Fact / Derived Estimate / Proxy / Scenario로 분류합니다.</w:t>
+      </w:r>
+    </w:p>
+    <w:p>
+      <w:pPr>
+        <w:spacing w:after="140"/>
+      </w:pPr>
+      <w:r>
+        <w:rPr>
+          <w:rFonts w:ascii="Apple SD Gothic Neo" w:hAnsi="Apple SD Gothic Neo"/>
+          <w:sz w:val="20"/>
+        </w:rPr>
+        <w:t>3. purpose-built hardware에 TPS/MW premium을 주려면 model, precision, ISL/OSL, latency scenario가 맞는 comparable output-token benchmark를 요구합니다.</w:t>
+      </w:r>
+    </w:p>
+    <w:p>
+      <w:pPr>
+        <w:spacing w:after="140"/>
+      </w:pPr>
+      <w:r>
+        <w:rPr>
+          <w:rFonts w:ascii="Apple SD Gothic Neo" w:hAnsi="Apple SD Gothic Neo"/>
+          <w:sz w:val="20"/>
+        </w:rPr>
+        <w:t>4. 해당 agent의 evidence.md와 state.md에 후보를 쓰되, orchestrator review 전 generator는 수정하지 않습니다.</w:t>
+      </w:r>
+    </w:p>
+    <w:p>
+      <w:pPr>
         <w:pStyle w:val="Heading1"/>
       </w:pPr>
       <w:r>
@@ -1641,7 +2181,55 @@
           <w:rFonts w:ascii="Apple SD Gothic Neo" w:hAnsi="Apple SD Gothic Neo"/>
           <w:sz w:val="20"/>
         </w:rPr>
+        <w:t>| EIA_DC_POWER | U.S. data center electricity demand and grid context | U.S. EIA | accessed 2026-06-09 | electricity demand and regional power baseline | A01,A02 | https://www.eia.gov/ |</w:t>
+      </w:r>
+    </w:p>
+    <w:p>
+      <w:pPr>
+        <w:spacing w:after="140"/>
+      </w:pPr>
+      <w:r>
+        <w:rPr>
+          <w:rFonts w:ascii="Apple SD Gothic Neo" w:hAnsi="Apple SD Gothic Neo"/>
+          <w:sz w:val="20"/>
+        </w:rPr>
+        <w:t>| FERC_INTERCONNECT | FERC generator interconnection and grid proceedings | FERC | accessed 2026-06-09 | interconnection, transmission and reliability context | A01,A02 | https://www.ferc.gov/ |</w:t>
+      </w:r>
+    </w:p>
+    <w:p>
+      <w:pPr>
+        <w:spacing w:after="140"/>
+      </w:pPr>
+      <w:r>
+        <w:rPr>
+          <w:rFonts w:ascii="Apple SD Gothic Neo" w:hAnsi="Apple SD Gothic Neo"/>
+          <w:sz w:val="20"/>
+        </w:rPr>
         <w:t>| UPTIME_COOLING | Cooling Systems Survey 2024 | Uptime Institute | 2024 | liquid cooling adoption and constraints | A03,A04 | https://intelligence.uptimeinstitute.com/sites/default/files/2024-05/Uptime%20Institute%20Cooling%20Systems%20Survey%202024_0.pdf |</w:t>
+      </w:r>
+    </w:p>
+    <w:p>
+      <w:pPr>
+        <w:spacing w:after="140"/>
+      </w:pPr>
+      <w:r>
+        <w:rPr>
+          <w:rFonts w:ascii="Apple SD Gothic Neo" w:hAnsi="Apple SD Gothic Neo"/>
+          <w:sz w:val="20"/>
+        </w:rPr>
+        <w:t>| UPTIME_GLOBAL_DC | Uptime Institute Global Data Center Survey | Uptime Institute | accessed 2026-06-09 | PUE, cooling, outage and density operating context | A03,A04 | https://uptimeinstitute.com/resources/research-and-reports |</w:t>
+      </w:r>
+    </w:p>
+    <w:p>
+      <w:pPr>
+        <w:spacing w:after="140"/>
+      </w:pPr>
+      <w:r>
+        <w:rPr>
+          <w:rFonts w:ascii="Apple SD Gothic Neo" w:hAnsi="Apple SD Gothic Neo"/>
+          <w:sz w:val="20"/>
+        </w:rPr>
+        <w:t>| ASHRAE_TC99 | ASHRAE TC 9.9 data center thermal guidance | ASHRAE | accessed 2026-06-09 | thermal envelope and cooling design reference | A03 | https://www.ashrae.org/technical-resources/bookstore/datacom-series |</w:t>
       </w:r>
     </w:p>
     <w:p>
@@ -1689,6 +2277,114 @@
           <w:rFonts w:ascii="Apple SD Gothic Neo" w:hAnsi="Apple SD Gothic Neo"/>
           <w:sz w:val="20"/>
         </w:rPr>
+        <w:t>| MLPERF_INFERENCE | MLPerf Inference benchmark results | MLCommons | accessed 2026-06-09 | official inference submission anchor | A08,A09,A11 | https://mlcommons.org/benchmarks/inference-datacenter/ |</w:t>
+      </w:r>
+    </w:p>
+    <w:p>
+      <w:pPr>
+        <w:spacing w:after="140"/>
+      </w:pPr>
+      <w:r>
+        <w:rPr>
+          <w:rFonts w:ascii="Apple SD Gothic Neo" w:hAnsi="Apple SD Gothic Neo"/>
+          <w:sz w:val="20"/>
+        </w:rPr>
+        <w:t>| MLPERF_POWER | MLPerf Power methodology and results | MLCommons | accessed 2026-06-09 | optional measured power/performance anchor | A08,A09,A11 | https://mlcommons.org/benchmarks/power/ |</w:t>
+      </w:r>
+    </w:p>
+    <w:p>
+      <w:pPr>
+        <w:spacing w:after="140"/>
+      </w:pPr>
+      <w:r>
+        <w:rPr>
+          <w:rFonts w:ascii="Apple SD Gothic Neo" w:hAnsi="Apple SD Gothic Neo"/>
+          <w:sz w:val="20"/>
+        </w:rPr>
+        <w:t>| MLPERF_INFERENCE_DOCS | MLPerf Inference documentation | MLCommons | accessed 2026-06-09 | benchmark rules, scenarios, loadgen, divisions | A08,A09 | https://docs.mlcommons.org/inference/ |</w:t>
+      </w:r>
+    </w:p>
+    <w:p>
+      <w:pPr>
+        <w:spacing w:after="140"/>
+      </w:pPr>
+      <w:r>
+        <w:rPr>
+          <w:rFonts w:ascii="Apple SD Gothic Neo" w:hAnsi="Apple SD Gothic Neo"/>
+          <w:sz w:val="20"/>
+        </w:rPr>
+        <w:t>| VLLM_DOCS | vLLM documentation | vLLM project | accessed 2026-06-09 | production serving mechanism, scheduler and KV cache behavior | A08,A09 | https://docs.vllm.ai/ |</w:t>
+      </w:r>
+    </w:p>
+    <w:p>
+      <w:pPr>
+        <w:spacing w:after="140"/>
+      </w:pPr>
+      <w:r>
+        <w:rPr>
+          <w:rFonts w:ascii="Apple SD Gothic Neo" w:hAnsi="Apple SD Gothic Neo"/>
+          <w:sz w:val="20"/>
+        </w:rPr>
+        <w:t>| TENSORRT_LLM | NVIDIA TensorRT-LLM documentation | NVIDIA | accessed 2026-06-09 | vendor-optimized inference stack | A08,A09,A11 | https://nvidia.github.io/TensorRT-LLM/ |</w:t>
+      </w:r>
+    </w:p>
+    <w:p>
+      <w:pPr>
+        <w:spacing w:after="140"/>
+      </w:pPr>
+      <w:r>
+        <w:rPr>
+          <w:rFonts w:ascii="Apple SD Gothic Neo" w:hAnsi="Apple SD Gothic Neo"/>
+          <w:sz w:val="20"/>
+        </w:rPr>
+        <w:t>| SGLANG_DOCS | SGLang documentation | SGLang project | accessed 2026-06-09 | serving runtime, structured generation and batching | A08,A09 | https://docs.sglang.ai/ |</w:t>
+      </w:r>
+    </w:p>
+    <w:p>
+      <w:pPr>
+        <w:spacing w:after="140"/>
+      </w:pPr>
+      <w:r>
+        <w:rPr>
+          <w:rFonts w:ascii="Apple SD Gothic Neo" w:hAnsi="Apple SD Gothic Neo"/>
+          <w:sz w:val="20"/>
+        </w:rPr>
+        <w:t>| FLASHINFER | FlashInfer documentation | FlashInfer project | accessed 2026-06-09 | attention/decode kernel mechanism | A08,A09 | https://docs.flashinfer.ai/ |</w:t>
+      </w:r>
+    </w:p>
+    <w:p>
+      <w:pPr>
+        <w:spacing w:after="140"/>
+      </w:pPr>
+      <w:r>
+        <w:rPr>
+          <w:rFonts w:ascii="Apple SD Gothic Neo" w:hAnsi="Apple SD Gothic Neo"/>
+          <w:sz w:val="20"/>
+        </w:rPr>
+        <w:t>| SARATHI_SERVE | Sarathi-Serve | arXiv | 2024 | chunked prefill and decode scheduling | A08,A09 | https://arxiv.org/abs/2403.02310 |</w:t>
+      </w:r>
+    </w:p>
+    <w:p>
+      <w:pPr>
+        <w:spacing w:after="140"/>
+      </w:pPr>
+      <w:r>
+        <w:rPr>
+          <w:rFonts w:ascii="Apple SD Gothic Neo" w:hAnsi="Apple SD Gothic Neo"/>
+          <w:sz w:val="20"/>
+        </w:rPr>
+        <w:t>| ORCA_SERVING | Orca: A Distributed Serving System for Transformer-Based Generative Models | OSDI | 2022 | iteration-level scheduling and batching foundation | A08,A09 | https://www.usenix.org/conference/osdi22/presentation/yu |</w:t>
+      </w:r>
+    </w:p>
+    <w:p>
+      <w:pPr>
+        <w:spacing w:after="140"/>
+      </w:pPr>
+      <w:r>
+        <w:rPr>
+          <w:rFonts w:ascii="Apple SD Gothic Neo" w:hAnsi="Apple SD Gothic Neo"/>
+          <w:sz w:val="20"/>
+        </w:rPr>
         <w:t>| ARXIV_HETEROGENEOUS_2602 | Large-Scale LLM Inference with Heterogeneous Workloads | arXiv | 2026 | prefill-decode contention and control | A08,A09 | https://arxiv.org/abs/2602.02987 |</w:t>
       </w:r>
     </w:p>
@@ -1809,7 +2505,43 @@
           <w:rFonts w:ascii="Apple SD Gothic Neo" w:hAnsi="Apple SD Gothic Neo"/>
           <w:sz w:val="20"/>
         </w:rPr>
+        <w:t>| NVIDIA_B200_DATASHEET | NVIDIA Blackwell architecture and B200/GB200 data center docs | NVIDIA | accessed 2026-06-09 | accelerator/rack power and platform specs | A02,A08,A11 | https://www.nvidia.com/en-us/data-center/ |</w:t>
+      </w:r>
+    </w:p>
+    <w:p>
+      <w:pPr>
+        <w:spacing w:after="140"/>
+      </w:pPr>
+      <w:r>
+        <w:rPr>
+          <w:rFonts w:ascii="Apple SD Gothic Neo" w:hAnsi="Apple SD Gothic Neo"/>
+          <w:sz w:val="20"/>
+        </w:rPr>
         <w:t>| GOOGLE_IRONWOOD | Ironwood TPU: age of inference | Google Cloud | 2025 | inference-optimized TPU direction | A05,A08 | https://blog.google/products/google-cloud/ironwood-tpu-age-of-inference/ |</w:t>
+      </w:r>
+    </w:p>
+    <w:p>
+      <w:pPr>
+        <w:spacing w:after="140"/>
+      </w:pPr>
+      <w:r>
+        <w:rPr>
+          <w:rFonts w:ascii="Apple SD Gothic Neo" w:hAnsi="Apple SD Gothic Neo"/>
+          <w:sz w:val="20"/>
+        </w:rPr>
+        <w:t>| GOOGLE_TPU_DOCS | Cloud TPU documentation | Google Cloud | accessed 2026-06-09 | TPU generation and serving/training platform docs | A02,A05,A08,A11 | https://cloud.google.com/tpu/docs |</w:t>
+      </w:r>
+    </w:p>
+    <w:p>
+      <w:pPr>
+        <w:spacing w:after="140"/>
+      </w:pPr>
+      <w:r>
+        <w:rPr>
+          <w:rFonts w:ascii="Apple SD Gothic Neo" w:hAnsi="Apple SD Gothic Neo"/>
+          <w:sz w:val="20"/>
+        </w:rPr>
+        <w:t>| MS_MAIA | Azure Maia AI Accelerator | Microsoft Azure | 2023/2026 accessed | first-party accelerator deployment direction | A02,A05,A10,A11 | https://azure.microsoft.com/en-us/blog/introducing-azure-maia-100/ |</w:t>
       </w:r>
     </w:p>
     <w:p>
@@ -1845,6 +2577,66 @@
           <w:rFonts w:ascii="Apple SD Gothic Neo" w:hAnsi="Apple SD Gothic Neo"/>
           <w:sz w:val="20"/>
         </w:rPr>
+        <w:t>| ANTHROPIC_AMAZON_COMPUTE | Amazon and Anthropic strategic collaboration | Amazon | accessed 2026-06-09 | host provider vs model owner compute relationship | A02,A10 | https://www.aboutamazon.com/news/aws/amazon-anthropic-ai-investment |</w:t>
+      </w:r>
+    </w:p>
+    <w:p>
+      <w:pPr>
+        <w:spacing w:after="140"/>
+      </w:pPr>
+      <w:r>
+        <w:rPr>
+          <w:rFonts w:ascii="Apple SD Gothic Neo" w:hAnsi="Apple SD Gothic Neo"/>
+          <w:sz w:val="20"/>
+        </w:rPr>
+        <w:t>| GOOGLE_CLOUD_ANTHROPIC | Google Cloud and Anthropic partnership | Google Cloud | accessed 2026-06-09 | third-party model hosted on cloud provider | A02,A10 | https://cloud.google.com/blog/products/ai-machine-learning/google-cloud-anthropic-ai-partnership |</w:t>
+      </w:r>
+    </w:p>
+    <w:p>
+      <w:pPr>
+        <w:spacing w:after="140"/>
+      </w:pPr>
+      <w:r>
+        <w:rPr>
+          <w:rFonts w:ascii="Apple SD Gothic Neo" w:hAnsi="Apple SD Gothic Neo"/>
+          <w:sz w:val="20"/>
+        </w:rPr>
+        <w:t>| AZURE_OPENAI | Azure OpenAI Service documentation | Microsoft | accessed 2026-06-09 | Microsoft host/product surface vs OpenAI model attribution | A10 | https://learn.microsoft.com/azure/ai-services/openai/ |</w:t>
+      </w:r>
+    </w:p>
+    <w:p>
+      <w:pPr>
+        <w:spacing w:after="140"/>
+      </w:pPr>
+      <w:r>
+        <w:rPr>
+          <w:rFonts w:ascii="Apple SD Gothic Neo" w:hAnsi="Apple SD Gothic Neo"/>
+          <w:sz w:val="20"/>
+        </w:rPr>
+        <w:t>| OPENAI_API_PRICING | OpenAI API pricing | OpenAI | accessed 2026-06-09 | model-owner commercial token surface proxy | A05,A10 | https://openai.com/api/pricing/ |</w:t>
+      </w:r>
+    </w:p>
+    <w:p>
+      <w:pPr>
+        <w:spacing w:after="140"/>
+      </w:pPr>
+      <w:r>
+        <w:rPr>
+          <w:rFonts w:ascii="Apple SD Gothic Neo" w:hAnsi="Apple SD Gothic Neo"/>
+          <w:sz w:val="20"/>
+        </w:rPr>
+        <w:t>| ANTHROPIC_PRICING | Anthropic API pricing | Anthropic | accessed 2026-06-09 | model-owner commercial token surface proxy | A05,A10 | https://www.anthropic.com/pricing |</w:t>
+      </w:r>
+    </w:p>
+    <w:p>
+      <w:pPr>
+        <w:spacing w:after="140"/>
+      </w:pPr>
+      <w:r>
+        <w:rPr>
+          <w:rFonts w:ascii="Apple SD Gothic Neo" w:hAnsi="Apple SD Gothic Neo"/>
+          <w:sz w:val="20"/>
+        </w:rPr>
         <w:t>| DEEPSEEK_V3 | DeepSeek-V3 Technical Report / GitHub | DeepSeek | 2024 | MoE total/active parameter anchor | A07,A08 | https://github.com/deepseek-ai/DeepSeek-V3 |</w:t>
       </w:r>
     </w:p>
@@ -1869,7 +2661,91 @@
           <w:rFonts w:ascii="Apple SD Gothic Neo" w:hAnsi="Apple SD Gothic Neo"/>
           <w:sz w:val="20"/>
         </w:rPr>
+        <w:t>| META_LLAMA | Llama model family and model cards | Meta AI | accessed 2026-06-09 | Llama open model parameter and context anchor | A07,A08,A10 | https://www.llama.com/ |</w:t>
+      </w:r>
+    </w:p>
+    <w:p>
+      <w:pPr>
+        <w:spacing w:after="140"/>
+      </w:pPr>
+      <w:r>
+        <w:rPr>
+          <w:rFonts w:ascii="Apple SD Gothic Neo" w:hAnsi="Apple SD Gothic Neo"/>
+          <w:sz w:val="20"/>
+        </w:rPr>
+        <w:t>| META_LLAMA4_NVIDIA | Meta Llama 4 NVIDIA optimization notes | NVIDIA Developer | 2025 | Llama 4 MoE total/active parameter anchor | A07,A08 | https://developer.nvidia.com/blog/meta-llama-4-first-nvidia-optimized-mixture-of-experts-models/ |</w:t>
+      </w:r>
+    </w:p>
+    <w:p>
+      <w:pPr>
+        <w:spacing w:after="140"/>
+      </w:pPr>
+      <w:r>
+        <w:rPr>
+          <w:rFonts w:ascii="Apple SD Gothic Neo" w:hAnsi="Apple SD Gothic Neo"/>
+          <w:sz w:val="20"/>
+        </w:rPr>
+        <w:t>| MISTRAL_MODELS | Mistral AI models and documentation | Mistral AI | accessed 2026-06-09 | dense/MoE open model family anchor | A07,A08 | https://docs.mistral.ai/ |</w:t>
+      </w:r>
+    </w:p>
+    <w:p>
+      <w:pPr>
+        <w:spacing w:after="140"/>
+      </w:pPr>
+      <w:r>
+        <w:rPr>
+          <w:rFonts w:ascii="Apple SD Gothic Neo" w:hAnsi="Apple SD Gothic Neo"/>
+          <w:sz w:val="20"/>
+        </w:rPr>
+        <w:t>| DBRX_MODEL | DBRX model announcement and model card | Databricks | 2024 | open MoE parameter anchor | A07,A08 | https://www.databricks.com/blog/introducing-dbrx-new-state-art-open-llm |</w:t>
+      </w:r>
+    </w:p>
+    <w:p>
+      <w:pPr>
+        <w:spacing w:after="140"/>
+      </w:pPr>
+      <w:r>
+        <w:rPr>
+          <w:rFonts w:ascii="Apple SD Gothic Neo" w:hAnsi="Apple SD Gothic Neo"/>
+          <w:sz w:val="20"/>
+        </w:rPr>
+        <w:t>| OPENAI_MODEL_DOCS | OpenAI model docs | OpenAI | accessed 2026-06-09 | closed model context/output/pricing, not parameter fact | A07,A10 | https://platform.openai.com/docs/models |</w:t>
+      </w:r>
+    </w:p>
+    <w:p>
+      <w:pPr>
+        <w:spacing w:after="140"/>
+      </w:pPr>
+      <w:r>
+        <w:rPr>
+          <w:rFonts w:ascii="Apple SD Gothic Neo" w:hAnsi="Apple SD Gothic Neo"/>
+          <w:sz w:val="20"/>
+        </w:rPr>
         <w:t>| STANFORD_INDEX_2025 | AI Index Report 2025 | Stanford HAI | 2025 | macro AI compute/cost context | A06,A08,A10 | https://hai.stanford.edu/ai-index/2025-ai-index-report |</w:t>
+      </w:r>
+    </w:p>
+    <w:p>
+      <w:pPr>
+        <w:spacing w:after="140"/>
+      </w:pPr>
+      <w:r>
+        <w:rPr>
+          <w:rFonts w:ascii="Apple SD Gothic Neo" w:hAnsi="Apple SD Gothic Neo"/>
+          <w:sz w:val="20"/>
+        </w:rPr>
+        <w:t>| EPRI_EPOCH_SCALING | Scaling Intelligence | EPRI / Epoch AI | 2025 | AI power capacity and frontier training scenario | A02,A06 | https://www.epri.com/research/products/000000003002033669 |</w:t>
+      </w:r>
+    </w:p>
+    <w:p>
+      <w:pPr>
+        <w:spacing w:after="140"/>
+      </w:pPr>
+      <w:r>
+        <w:rPr>
+          <w:rFonts w:ascii="Apple SD Gothic Neo" w:hAnsi="Apple SD Gothic Neo"/>
+          <w:sz w:val="20"/>
+        </w:rPr>
+        <w:t>| EPOCH_TRAIN | Training compute of frontier AI models grows by 4-5x per year | Epoch AI | 2024 | frontier training compute growth | A06 | https://epoch.ai/blog/training-compute-of-frontier-ai-models-grows-by-4-5x-per-year |</w:t>
       </w:r>
     </w:p>
     <w:p>
@@ -1893,7 +2769,79 @@
           <w:rFonts w:ascii="Apple SD Gothic Neo" w:hAnsi="Apple SD Gothic Neo"/>
           <w:sz w:val="20"/>
         </w:rPr>
+        <w:t>| EPOCH_SCALING_2030 | Can AI scaling continue through 2030? | Epoch AI | 2024/2026 accessed | scaling bottlenecks, power/data/capex | A01,A02,A06 | https://epoch.ai/publications/can-ai-scaling-continue-through-2030 |</w:t>
+      </w:r>
+    </w:p>
+    <w:p>
+      <w:pPr>
+        <w:spacing w:after="140"/>
+      </w:pPr>
+      <w:r>
+        <w:rPr>
+          <w:rFonts w:ascii="Apple SD Gothic Neo" w:hAnsi="Apple SD Gothic Neo"/>
+          <w:sz w:val="20"/>
+        </w:rPr>
+        <w:t>| EPOCH_INFERENCE_PRICE | LLM inference price trends | Epoch AI | accessed 2026-06-09 | inference cost trend proxy, not production efficiency fact | A05,A08 | https://epoch.ai/data-insights/llm-inference-price-trends |</w:t>
+      </w:r>
+    </w:p>
+    <w:p>
+      <w:pPr>
+        <w:spacing w:after="140"/>
+      </w:pPr>
+      <w:r>
+        <w:rPr>
+          <w:rFonts w:ascii="Apple SD Gothic Neo" w:hAnsi="Apple SD Gothic Neo"/>
+          <w:sz w:val="20"/>
+        </w:rPr>
         <w:t>| EPOCH_GPU_POWER | GPUs account for about 40% of power usage in AI data centers | Epoch AI | 2025 | facility/IT/GPU decomposition | A03,A04 | https://epoch.ai/data-insights/gpus-power-usage-in-ai-data-centers |</w:t>
+      </w:r>
+    </w:p>
+    <w:p>
+      <w:pPr>
+        <w:spacing w:after="140"/>
+      </w:pPr>
+      <w:r>
+        <w:rPr>
+          <w:rFonts w:ascii="Apple SD Gothic Neo" w:hAnsi="Apple SD Gothic Neo"/>
+          <w:sz w:val="20"/>
+        </w:rPr>
+        <w:t>| ARTIFICIAL_ANALYSIS | Artificial Analysis model and API pricing benchmarks | Artificial Analysis | accessed 2026-06-09 | public API price/performance and latency proxy | A05,A08,A10 | https://artificialanalysis.ai/ |</w:t>
+      </w:r>
+    </w:p>
+    <w:p>
+      <w:pPr>
+        <w:spacing w:after="140"/>
+      </w:pPr>
+      <w:r>
+        <w:rPr>
+          <w:rFonts w:ascii="Apple SD Gothic Neo" w:hAnsi="Apple SD Gothic Neo"/>
+          <w:sz w:val="20"/>
+        </w:rPr>
+        <w:t>| OPENROUTER_RANKINGS | OpenRouter model pricing and usage market signals | OpenRouter | accessed 2026-06-09 | API price and demand mix proxy | A05,A10 | https://openrouter.ai/rankings |</w:t>
+      </w:r>
+    </w:p>
+    <w:p>
+      <w:pPr>
+        <w:spacing w:after="140"/>
+      </w:pPr>
+      <w:r>
+        <w:rPr>
+          <w:rFonts w:ascii="Apple SD Gothic Neo" w:hAnsi="Apple SD Gothic Neo"/>
+          <w:sz w:val="20"/>
+        </w:rPr>
+        <w:t>| SEMI_100K_CLUSTER | SemiAnalysis 100k H100 cluster / AI infrastructure analysis | SemiAnalysis | accessed 2026-06-09 | accelerator cluster, networking and non-GPU overhead context | A04,A08 | https://semianalysis.com/ |</w:t>
+      </w:r>
+    </w:p>
+    <w:p>
+      <w:pPr>
+        <w:spacing w:after="140"/>
+      </w:pPr>
+      <w:r>
+        <w:rPr>
+          <w:rFonts w:ascii="Apple SD Gothic Neo" w:hAnsi="Apple SD Gothic Neo"/>
+          <w:sz w:val="20"/>
+        </w:rPr>
+        <w:t>| DELLORO_AI_NETWORKS | AI networks and data center switch market context | Dell'Oro Group | accessed 2026-06-09 | network/power overhead and AI cluster infrastructure context | A04 | https://www.delloro.com/ |</w:t>
       </w:r>
     </w:p>
     <w:p>
@@ -1953,7 +2901,7 @@
         <w:pStyle w:val="ListBullet"/>
       </w:pPr>
       <w:r>
-        <w:t>A01, A02, A03, A04가 IEA/LBNL/EPRI/Uptime/NVIDIA DGX GB/Epoch GPU power 자료를 읽습니다.</w:t>
+        <w:t>A01, A02, A03, A04가 IEA/LBNL/EPRI/EIA/FERC/Uptime/ASHRAE/NVIDIA DGX GB/Epoch GPU power 자료를 읽습니다.</w:t>
       </w:r>
     </w:p>
     <w:p>
@@ -1977,7 +2925,7 @@
         <w:pStyle w:val="ListBullet"/>
       </w:pPr>
       <w:r>
-        <w:t>A08, A09가 PagedAttention, Splitwise, DistServe, IBM PD 2026, Joule inference energy, InferenceX를 읽습니다.</w:t>
+        <w:t>A08, A09, A11이 MLPerf Inference/Power, InferenceX, vLLM, TensorRT-LLM, SGLang, FlashInfer, PagedAttention, Splitwise, DistServe, Sarathi, Orca, IBM PD 2026, Joule inference energy를 읽습니다.</w:t>
       </w:r>
     </w:p>
     <w:p>
@@ -1985,7 +2933,7 @@
         <w:pStyle w:val="ListBullet"/>
       </w:pPr>
       <w:r>
-        <w:t>산출물: tokens/MW proxy ladder, utilization caveat sheet, benchmark-to-production gap map.</w:t>
+        <w:t>산출물: official-submission vs LLM-serving-proxy bridge, tokens/MW proxy ladder, utilization caveat sheet, benchmark-to-production gap map, comparable accelerator replacement checklist.</w:t>
       </w:r>
     </w:p>
     <w:p>
@@ -2001,7 +2949,7 @@
         <w:pStyle w:val="ListBullet"/>
       </w:pPr>
       <w:r>
-        <w:t>A06, A07가 Epoch/Stanford/DeepSeek/Qwen 자료를 읽습니다.</w:t>
+        <w:t>A06, A07가 Epoch AI, EPRI/Epoch, Stanford, DeepSeek, Qwen, Llama, Mistral, DBRX, OpenAI model docs를 읽습니다.</w:t>
       </w:r>
     </w:p>
     <w:p>
@@ -2009,7 +2957,7 @@
         <w:pStyle w:val="ListBullet"/>
       </w:pPr>
       <w:r>
-        <w:t>산출물: training reserve interpretation, MoE active parameter source table.</w:t>
+        <w:t>산출물: training reserve interpretation, open-model active parameter table, closed-model parameter caveat map.</w:t>
       </w:r>
     </w:p>
     <w:p>
@@ -2025,7 +2973,7 @@
         <w:pStyle w:val="ListBullet"/>
       </w:pPr>
       <w:r>
-        <w:t>A05, A10, orchestrator가 AI 2027, OpenAI Stargate, AWS Rainier, market context를 읽습니다.</w:t>
+        <w:t>A05, A10, orchestrator가 AI 2027, OpenAI Stargate/API pricing, AWS Rainier, Anthropic/Amazon, Google Cloud/Anthropic, Azure OpenAI, Artificial Analysis, OpenRouter, market context를 읽습니다.</w:t>
       </w:r>
     </w:p>
     <w:p>
@@ -2033,7 +2981,7 @@
         <w:pStyle w:val="ListBullet"/>
       </w:pPr>
       <w:r>
-        <w:t>산출물: AI-2027 stress scenario memo, host/model-owner attribution map.</w:t>
+        <w:t>산출물: AI-2027 stress scenario memo, host/model-owner attribution map, API price/demand proxy caveat sheet.</w:t>
       </w:r>
     </w:p>
     <w:p>

</xml_diff>